<commit_message>
Sharpen the resume for production AI roles
</commit_message>
<xml_diff>
--- a/docs/resume.docx
+++ b/docs/resume.docx
@@ -49,6 +49,24 @@
           <w:p>
             <w:pPr>
               <w:pStyle w:val="Centered"/>
+              <w:spacing w:after="20"/>
+              <w:jc w:val="center"/>
+            </w:pPr>
+            <w:r>
+              <w:rPr>
+                <w:rFonts w:ascii="Helvetica Neue" w:cs="Helvetica Neue" w:eastAsia="Helvetica Neue" w:hAnsi="Helvetica Neue"/>
+                <w:b/>
+                <w:bCs/>
+                <w:color w:val="1A1A1A"/>
+                <w:sz w:val="19"/>
+                <w:szCs w:val="19"/>
+              </w:rPr>
+              <w:t xml:space="preserve">Senior Product Engineer | Production AI &amp; Agent Systems</w:t>
+            </w:r>
+          </w:p>
+          <w:p>
+            <w:pPr>
+              <w:pStyle w:val="Centered"/>
               <w:spacing w:after="40"/>
               <w:jc w:val="center"/>
             </w:pPr>
@@ -61,7 +79,7 @@
               </w:rPr>
               <w:t xml:space="preserve">Laurel, MD · (443) 805-3963 · </w:t>
             </w:r>
-            <w:hyperlink w:history="1" r:id="rIdzdeefhn-xar5abavezlxd">
+            <w:hyperlink w:history="1" r:id="rIdratxfutpu7irurwoledk-">
               <w:r>
                 <w:rPr>
                   <w:rFonts w:ascii="Helvetica Neue" w:cs="Helvetica Neue" w:eastAsia="Helvetica Neue" w:hAnsi="Helvetica Neue"/>
@@ -82,7 +100,7 @@
               </w:rPr>
               <w:t xml:space="preserve"> · </w:t>
             </w:r>
-            <w:hyperlink w:history="1" r:id="rIdmr0wgxe_ep9aooyqbnhk1">
+            <w:hyperlink w:history="1" r:id="rIdludydnl_a9ololhxfoqz3">
               <w:r>
                 <w:rPr>
                   <w:rFonts w:ascii="Helvetica Neue" w:cs="Helvetica Neue" w:eastAsia="Helvetica Neue" w:hAnsi="Helvetica Neue"/>
@@ -103,7 +121,7 @@
               </w:rPr>
               <w:t xml:space="preserve"> · </w:t>
             </w:r>
-            <w:hyperlink w:history="1" r:id="rId8iiv0k33lua3vj_x7m5ir">
+            <w:hyperlink w:history="1" r:id="rIdtqeznbupwjemszrcth_3-">
               <w:r>
                 <w:rPr>
                   <w:rFonts w:ascii="Helvetica Neue" w:cs="Helvetica Neue" w:eastAsia="Helvetica Neue" w:hAnsi="Helvetica Neue"/>
@@ -175,7 +193,7 @@
           <w:sz w:val="18"/>
           <w:szCs w:val="18"/>
         </w:rPr>
-        <w:t xml:space="preserve">Product engineer who ships complete systems end-to-end, and builds the AI-agent infrastructure that lets AI-assisted teams ship safely: production LLM assistants, agentic development workflows, and review harnesses.</w:t>
+        <w:t xml:space="preserve">Senior product engineer who builds and ships reliable systems end to end, with particular depth in production LLM applications and the agent-ready infrastructure that makes AI-assisted development safe, observable, and verifiable.</w:t>
       </w:r>
     </w:p>
     <w:tbl>
@@ -255,7 +273,7 @@
             <w:pPr>
               <w:spacing w:after="0" w:before="30"/>
             </w:pPr>
-            <w:hyperlink w:history="1" r:id="rIdiudgtgr5d8zuyqy9esuq0">
+            <w:hyperlink w:history="1" r:id="rIdecdvegbt2t30pv-pyl5iu">
               <w:r>
                 <w:rPr>
                   <w:rFonts w:ascii="Helvetica Neue" w:cs="Helvetica Neue" w:eastAsia="Helvetica Neue" w:hAnsi="Helvetica Neue"/>
@@ -266,7 +284,7 @@
                   <w:szCs w:val="19"/>
                   <w:u w:val="single" w:color="1A1A1A"/>
                 </w:rPr>
-                <w:t xml:space="preserve">Athena, Sole Engineer</w:t>
+                <w:t xml:space="preserve">Sole Product Engineer — Athena</w:t>
               </w:r>
             </w:hyperlink>
           </w:p>
@@ -333,7 +351,7 @@
           <w:sz w:val="18"/>
           <w:szCs w:val="18"/>
         </w:rPr>
-        <w:t xml:space="preserve">Built the full system as a TypeScript monorepo spanning point-of-sale, online storefront, inventory, payments, and service operations.</w:t>
+        <w:t xml:space="preserve">Built and operate the full TypeScript system across point-of-sale, online storefront, inventory, payments, and service operations; production now manages 1,800+ SKUs and has processed 1,100+ completed POS transactions.</w:t>
       </w:r>
     </w:p>
     <w:p>
@@ -371,7 +389,7 @@
           <w:sz w:val="18"/>
           <w:szCs w:val="18"/>
         </w:rPr>
-        <w:t xml:space="preserve">Built an agent-ready delivery harness (generated repo maps, deterministic and LLM-based review lanes, runtime behavior scenarios recording structured evidence, and drift sensors) so AI agents ship changes with the same safety rails as a human team.</w:t>
+        <w:t xml:space="preserve">Built an agent-ready delivery harness spanning 35 validation surfaces across three apps, combining generated repo maps, deterministic and LLM-based reviews, runtime evidence, and drift sensors; a recorded five-phase merge-grade run completed in under 10 minutes with zero duplicate commands.</w:t>
       </w:r>
     </w:p>
     <w:p>
@@ -425,7 +443,7 @@
             <w:pPr>
               <w:spacing w:after="0" w:before="30"/>
             </w:pPr>
-            <w:hyperlink w:history="1" r:id="rId2zmdtinfbn0gcb-5idkhw">
+            <w:hyperlink w:history="1" r:id="rIdtdpryijdle4cvcywmoae4">
               <w:r>
                 <w:rPr>
                   <w:rFonts w:ascii="Helvetica Neue" w:cs="Helvetica Neue" w:eastAsia="Helvetica Neue" w:hAnsi="Helvetica Neue"/>
@@ -436,7 +454,7 @@
                   <w:szCs w:val="19"/>
                   <w:u w:val="single" w:color="1A1A1A"/>
                 </w:rPr>
-                <w:t xml:space="preserve">kwamina.fyi, personal site with a grounded AI assistant</w:t>
+                <w:t xml:space="preserve">Product &amp; AI Engineer — kwamina.fyi (Independent Project)</w:t>
               </w:r>
             </w:hyperlink>
           </w:p>
@@ -585,7 +603,7 @@
                 <w:sz w:val="19"/>
                 <w:szCs w:val="19"/>
               </w:rPr>
-              <w:t xml:space="preserve">Eventbrite, Senior Software Engineer</w:t>
+              <w:t xml:space="preserve">Senior Software Engineer — Eventbrite</w:t>
             </w:r>
           </w:p>
         </w:tc>
@@ -768,51 +786,6 @@
         <w:t xml:space="preserve">Shipped a logged-out event-creation flow that removed account signup as a prerequisite to building an event, lifting event creation +26.6%, event publishing +5.4%, and transactions +2.2%.</w:t>
       </w:r>
     </w:p>
-    <w:tbl>
-      <w:tblPr>
-        <w:tblW w:type="dxa" w:w="11130"/>
-        <w:tblBorders>
-          <w:top w:val="none" w:color="FFFFFF" w:sz="0"/>
-          <w:left w:val="none" w:color="FFFFFF" w:sz="0"/>
-          <w:bottom w:val="single" w:color="999999" w:sz="4"/>
-          <w:right w:val="none" w:color="FFFFFF" w:sz="0"/>
-          <w:insideH w:val="none" w:color="FFFFFF" w:sz="0"/>
-          <w:insideV w:val="none" w:color="FFFFFF" w:sz="0"/>
-        </w:tblBorders>
-      </w:tblPr>
-      <w:tblGrid>
-        <w:gridCol w:w="11130"/>
-      </w:tblGrid>
-      <w:tr>
-        <w:tc>
-          <w:tcPr>
-            <w:tcW w:type="dxa" w:w="11130"/>
-            <w:tcMar>
-              <w:top w:type="dxa" w:w="0"/>
-              <w:left w:type="dxa" w:w="0"/>
-              <w:bottom w:type="dxa" w:w="0"/>
-              <w:right w:type="dxa" w:w="0"/>
-            </w:tcMar>
-          </w:tcPr>
-          <w:p>
-            <w:pPr>
-              <w:spacing w:after="0" w:before="60"/>
-            </w:pPr>
-            <w:r>
-              <w:rPr>
-                <w:rFonts w:ascii="Helvetica Neue" w:cs="Helvetica Neue" w:eastAsia="Helvetica Neue" w:hAnsi="Helvetica Neue"/>
-                <w:b/>
-                <w:bCs/>
-                <w:color w:val="1A1A1A"/>
-                <w:sz w:val="19"/>
-                <w:szCs w:val="19"/>
-              </w:rPr>
-              <w:t xml:space="preserve">EARLIER EXPERIENCE</w:t>
-            </w:r>
-          </w:p>
-        </w:tc>
-      </w:tr>
-    </w:tbl>
     <w:p>
       <w:pPr>
         <w:spacing w:after="40"/>
@@ -949,7 +922,7 @@
                 <w:sz w:val="19"/>
                 <w:szCs w:val="19"/>
               </w:rPr>
-              <w:t xml:space="preserve">B.Sc. Computer Science, University of Maryland, College Park</w:t>
+              <w:t xml:space="preserve">Bachelor of Science in Computer Science, University of Maryland, College Park</w:t>
             </w:r>
           </w:p>
         </w:tc>
@@ -1041,16 +1014,16 @@
           <w:sz w:val="18"/>
           <w:szCs w:val="18"/>
         </w:rPr>
-        <w:t xml:space="preserve">Languages &amp; frameworks: </w:t>
-      </w:r>
-      <w:r>
-        <w:rPr>
-          <w:rFonts w:ascii="Helvetica Neue" w:cs="Helvetica Neue" w:eastAsia="Helvetica Neue" w:hAnsi="Helvetica Neue"/>
-          <w:color w:val="1A1A1A"/>
-          <w:sz w:val="18"/>
-          <w:szCs w:val="18"/>
-        </w:rPr>
-        <w:t xml:space="preserve">TypeScript, Python, React, Next.js, Node/Bun · </w:t>
+        <w:t xml:space="preserve">Application engineering: </w:t>
+      </w:r>
+      <w:r>
+        <w:rPr>
+          <w:rFonts w:ascii="Helvetica Neue" w:cs="Helvetica Neue" w:eastAsia="Helvetica Neue" w:hAnsi="Helvetica Neue"/>
+          <w:color w:val="1A1A1A"/>
+          <w:sz w:val="18"/>
+          <w:szCs w:val="18"/>
+        </w:rPr>
+        <w:t xml:space="preserve">TypeScript, Python, Node.js, Bun, React, Next.js · </w:t>
       </w:r>
       <w:r>
         <w:rPr>
@@ -1061,16 +1034,16 @@
           <w:sz w:val="18"/>
           <w:szCs w:val="18"/>
         </w:rPr>
-        <w:t xml:space="preserve">Cloud &amp; infra: </w:t>
-      </w:r>
-      <w:r>
-        <w:rPr>
-          <w:rFonts w:ascii="Helvetica Neue" w:cs="Helvetica Neue" w:eastAsia="Helvetica Neue" w:hAnsi="Helvetica Neue"/>
-          <w:color w:val="1A1A1A"/>
-          <w:sz w:val="18"/>
-          <w:szCs w:val="18"/>
-        </w:rPr>
-        <w:t xml:space="preserve">AWS (Lambda, API Gateway, DynamoDB, CloudWatch), Terraform, Convex, PostgreSQL, Valkey/Redis, Cloudflare, CI/CD · </w:t>
+        <w:t xml:space="preserve">AI systems: </w:t>
+      </w:r>
+      <w:r>
+        <w:rPr>
+          <w:rFonts w:ascii="Helvetica Neue" w:cs="Helvetica Neue" w:eastAsia="Helvetica Neue" w:hAnsi="Helvetica Neue"/>
+          <w:color w:val="1A1A1A"/>
+          <w:sz w:val="18"/>
+          <w:szCs w:val="18"/>
+        </w:rPr>
+        <w:t xml:space="preserve">Production LLM applications, grounding and context engineering, prompt engineering and guardrails, streaming, LLM evaluation, AI observability · </w:t>
       </w:r>
       <w:r>
         <w:rPr>
@@ -1081,16 +1054,16 @@
           <w:sz w:val="18"/>
           <w:szCs w:val="18"/>
         </w:rPr>
-        <w:t xml:space="preserve">Payments: </w:t>
-      </w:r>
-      <w:r>
-        <w:rPr>
-          <w:rFonts w:ascii="Helvetica Neue" w:cs="Helvetica Neue" w:eastAsia="Helvetica Neue" w:hAnsi="Helvetica Neue"/>
-          <w:color w:val="1A1A1A"/>
-          <w:sz w:val="18"/>
-          <w:szCs w:val="18"/>
-        </w:rPr>
-        <w:t xml:space="preserve">Stripe, Radar, 3D Secure/SCA · </w:t>
+        <w:t xml:space="preserve">Agent engineering: </w:t>
+      </w:r>
+      <w:r>
+        <w:rPr>
+          <w:rFonts w:ascii="Helvetica Neue" w:cs="Helvetica Neue" w:eastAsia="Helvetica Neue" w:hAnsi="Helvetica Neue"/>
+          <w:color w:val="1A1A1A"/>
+          <w:sz w:val="18"/>
+          <w:szCs w:val="18"/>
+        </w:rPr>
+        <w:t xml:space="preserve">Agent-ready repositories, multi-agent orchestration, tool and skill design, deterministic and LLM-based review harnesses · </w:t>
       </w:r>
       <w:r>
         <w:rPr>
@@ -1101,16 +1074,36 @@
           <w:sz w:val="18"/>
           <w:szCs w:val="18"/>
         </w:rPr>
-        <w:t xml:space="preserve">AI: </w:t>
-      </w:r>
-      <w:r>
-        <w:rPr>
-          <w:rFonts w:ascii="Helvetica Neue" w:cs="Helvetica Neue" w:eastAsia="Helvetica Neue" w:hAnsi="Helvetica Neue"/>
-          <w:color w:val="1A1A1A"/>
-          <w:sz w:val="18"/>
-          <w:szCs w:val="18"/>
-        </w:rPr>
-        <w:t xml:space="preserve">LLM assistants (Amazon Bedrock, Claude), agentic dev workflows, eval &amp; review harnesses</w:t>
+        <w:t xml:space="preserve">Payments &amp; risk: </w:t>
+      </w:r>
+      <w:r>
+        <w:rPr>
+          <w:rFonts w:ascii="Helvetica Neue" w:cs="Helvetica Neue" w:eastAsia="Helvetica Neue" w:hAnsi="Helvetica Neue"/>
+          <w:color w:val="1A1A1A"/>
+          <w:sz w:val="18"/>
+          <w:szCs w:val="18"/>
+        </w:rPr>
+        <w:t xml:space="preserve">Stripe, Radar, 3D Secure/SCA · </w:t>
+      </w:r>
+      <w:r>
+        <w:rPr>
+          <w:rFonts w:ascii="Helvetica Neue" w:cs="Helvetica Neue" w:eastAsia="Helvetica Neue" w:hAnsi="Helvetica Neue"/>
+          <w:b/>
+          <w:bCs/>
+          <w:color w:val="1A1A1A"/>
+          <w:sz w:val="18"/>
+          <w:szCs w:val="18"/>
+        </w:rPr>
+        <w:t xml:space="preserve">Cloud, data &amp; delivery: </w:t>
+      </w:r>
+      <w:r>
+        <w:rPr>
+          <w:rFonts w:ascii="Helvetica Neue" w:cs="Helvetica Neue" w:eastAsia="Helvetica Neue" w:hAnsi="Helvetica Neue"/>
+          <w:color w:val="1A1A1A"/>
+          <w:sz w:val="18"/>
+          <w:szCs w:val="18"/>
+        </w:rPr>
+        <w:t xml:space="preserve">AWS, Cloudflare Workers/D1, Convex, PostgreSQL, Valkey/Redis, Terraform, CI/CD</w:t>
       </w:r>
     </w:p>
     <w:sectPr>

</xml_diff>

<commit_message>
Give the resume a descriptive document title
</commit_message>
<xml_diff>
--- a/docs/resume.docx
+++ b/docs/resume.docx
@@ -79,7 +79,7 @@
               </w:rPr>
               <w:t xml:space="preserve">Laurel, MD · (443) 805-3963 · </w:t>
             </w:r>
-            <w:hyperlink w:history="1" r:id="rIdratxfutpu7irurwoledk-">
+            <w:hyperlink w:history="1" r:id="rIdrpewfhwefg53gexffktl2">
               <w:r>
                 <w:rPr>
                   <w:rFonts w:ascii="Helvetica Neue" w:cs="Helvetica Neue" w:eastAsia="Helvetica Neue" w:hAnsi="Helvetica Neue"/>
@@ -100,7 +100,7 @@
               </w:rPr>
               <w:t xml:space="preserve"> · </w:t>
             </w:r>
-            <w:hyperlink w:history="1" r:id="rIdludydnl_a9ololhxfoqz3">
+            <w:hyperlink w:history="1" r:id="rId3jh77gbu9twb3kbazbd4z">
               <w:r>
                 <w:rPr>
                   <w:rFonts w:ascii="Helvetica Neue" w:cs="Helvetica Neue" w:eastAsia="Helvetica Neue" w:hAnsi="Helvetica Neue"/>
@@ -121,7 +121,7 @@
               </w:rPr>
               <w:t xml:space="preserve"> · </w:t>
             </w:r>
-            <w:hyperlink w:history="1" r:id="rIdtqeznbupwjemszrcth_3-">
+            <w:hyperlink w:history="1" r:id="rIde-lmx4x-vuhediy6tm9gx">
               <w:r>
                 <w:rPr>
                   <w:rFonts w:ascii="Helvetica Neue" w:cs="Helvetica Neue" w:eastAsia="Helvetica Neue" w:hAnsi="Helvetica Neue"/>
@@ -273,7 +273,7 @@
             <w:pPr>
               <w:spacing w:after="0" w:before="30"/>
             </w:pPr>
-            <w:hyperlink w:history="1" r:id="rIdecdvegbt2t30pv-pyl5iu">
+            <w:hyperlink w:history="1" r:id="rIdn3lq7pt1kgi9tiwnsqzgy">
               <w:r>
                 <w:rPr>
                   <w:rFonts w:ascii="Helvetica Neue" w:cs="Helvetica Neue" w:eastAsia="Helvetica Neue" w:hAnsi="Helvetica Neue"/>
@@ -443,7 +443,7 @@
             <w:pPr>
               <w:spacing w:after="0" w:before="30"/>
             </w:pPr>
-            <w:hyperlink w:history="1" r:id="rIdtdpryijdle4cvcywmoae4">
+            <w:hyperlink w:history="1" r:id="rId3uafsjgilqs1v56wbakvi">
               <w:r>
                 <w:rPr>
                   <w:rFonts w:ascii="Helvetica Neue" w:cs="Helvetica Neue" w:eastAsia="Helvetica Neue" w:hAnsi="Helvetica Neue"/>

</xml_diff>

<commit_message>
add linked in to resume
</commit_message>
<xml_diff>
--- a/docs/resume.docx
+++ b/docs/resume.docx
@@ -79,7 +79,7 @@
               </w:rPr>
               <w:t xml:space="preserve">Laurel, MD · (443) 805-3963 · </w:t>
             </w:r>
-            <w:hyperlink w:history="1" r:id="rId3vtoxqjojgu34jdlei9f0">
+            <w:hyperlink w:history="1" r:id="rIdqi1e7k4kp8lgz9-5n3wh8">
               <w:r>
                 <w:rPr>
                   <w:rFonts w:ascii="Helvetica Neue" w:cs="Helvetica Neue" w:eastAsia="Helvetica Neue" w:hAnsi="Helvetica Neue"/>
@@ -100,7 +100,7 @@
               </w:rPr>
               <w:t xml:space="preserve"> · </w:t>
             </w:r>
-            <w:hyperlink w:history="1" r:id="rIdypghcgbysmtxxmluopzmo">
+            <w:hyperlink w:history="1" r:id="rIdfqm6ruoilg5sfy46yncuq">
               <w:r>
                 <w:rPr>
                   <w:rFonts w:ascii="Helvetica Neue" w:cs="Helvetica Neue" w:eastAsia="Helvetica Neue" w:hAnsi="Helvetica Neue"/>
@@ -121,7 +121,28 @@
               </w:rPr>
               <w:t xml:space="preserve"> · </w:t>
             </w:r>
-            <w:hyperlink w:history="1" r:id="rIdxpf9jkqlzlsq54ggeak7l">
+            <w:hyperlink w:history="1" r:id="rIdzwq4zurqik8j-kad8udm2">
+              <w:r>
+                <w:rPr>
+                  <w:rFonts w:ascii="Helvetica Neue" w:cs="Helvetica Neue" w:eastAsia="Helvetica Neue" w:hAnsi="Helvetica Neue"/>
+                  <w:color w:val="555555"/>
+                  <w:sz w:val="17"/>
+                  <w:szCs w:val="17"/>
+                  <w:u w:val="single" w:color="555555"/>
+                </w:rPr>
+                <w:t xml:space="preserve">linkedin.com/in/kwamina-em</w:t>
+              </w:r>
+            </w:hyperlink>
+            <w:r>
+              <w:rPr>
+                <w:rFonts w:ascii="Helvetica Neue" w:cs="Helvetica Neue" w:eastAsia="Helvetica Neue" w:hAnsi="Helvetica Neue"/>
+                <w:color w:val="555555"/>
+                <w:sz w:val="17"/>
+                <w:szCs w:val="17"/>
+              </w:rPr>
+              <w:t xml:space="preserve"> · </w:t>
+            </w:r>
+            <w:hyperlink w:history="1" r:id="rIdtjlecebf75mge8myhrphw">
               <w:r>
                 <w:rPr>
                   <w:rFonts w:ascii="Helvetica Neue" w:cs="Helvetica Neue" w:eastAsia="Helvetica Neue" w:hAnsi="Helvetica Neue"/>
@@ -273,7 +294,7 @@
             <w:pPr>
               <w:spacing w:after="0" w:before="30"/>
             </w:pPr>
-            <w:hyperlink w:history="1" r:id="rIdpq-j2z-3lw1lsz3v1x285">
+            <w:hyperlink w:history="1" r:id="rIdjltis0qujfrkug7ja219x">
               <w:r>
                 <w:rPr>
                   <w:rFonts w:ascii="Helvetica Neue" w:cs="Helvetica Neue" w:eastAsia="Helvetica Neue" w:hAnsi="Helvetica Neue"/>
@@ -443,7 +464,7 @@
             <w:pPr>
               <w:spacing w:after="0" w:before="30"/>
             </w:pPr>
-            <w:hyperlink w:history="1" r:id="rIdxsyspyuktnej_5njn0lgm">
+            <w:hyperlink w:history="1" r:id="rIdejoocrl_zdp_8gh4l59rq">
               <w:r>
                 <w:rPr>
                   <w:rFonts w:ascii="Helvetica Neue" w:cs="Helvetica Neue" w:eastAsia="Helvetica Neue" w:hAnsi="Helvetica Neue"/>

</xml_diff>